<commit_message>
Skywise AI FDE: add cost monitoring with Resource Management
New slide 11 and guide section 7: AIP usage & limits, Analysis (All LLMs),
Budgets, and the over-threshold escalation to the solution architect.
Checklist and takeaways updated.

Co-Authored-By: Claude Opus 5.5 <noreply@anthropic.com>
Claude-Session: https://claude.ai/code/session_01HdxEbeqqWM97gKbcNqpjAq
</commit_message>
<xml_diff>
--- a/erm-migration/skywise-ai-fde/Skywise-AI-FDE-Best-Practices.docx
+++ b/erm-migration/skywise-ai-fde/Skywise-AI-FDE-Best-Practices.docx
@@ -29,7 +29,7 @@
           <w:i w:val="0"/>
           <w:color w:val="4A5568"/>
         </w:rPr>
-        <w:t xml:space="preserve">A practical guide for the team: what AI FDE is, what it can do, how to get real value from it, its limits, and how to keep token use under control. We use </w:t>
+        <w:t xml:space="preserve">A practical guide for the team: what AI FDE is, what it can do, how to get real value from it, its limits, how to keep token use under control, and how to monitor cost. We use </w:t>
       </w:r>
       <w:r>
         <w:rPr>
@@ -3159,7 +3159,470 @@
         <w:pStyle w:val="Heading1"/>
       </w:pPr>
       <w:r>
-        <w:t>7. Team practices</w:t>
+        <w:t>7. Monitoring cost in Resource Management</w:t>
+      </w:r>
+    </w:p>
+    <w:p>
+      <w:pPr>
+        <w:spacing w:after="120"/>
+      </w:pPr>
+      <w:r>
+        <w:rPr>
+          <w:b w:val="0"/>
+          <w:i w:val="0"/>
+        </w:rPr>
+        <w:t xml:space="preserve">Every AI FDE message spends Gemini tokens, and tokens are cost. The </w:t>
+      </w:r>
+      <w:r>
+        <w:rPr>
+          <w:b/>
+          <w:i w:val="0"/>
+        </w:rPr>
+        <w:t>Resource Management</w:t>
+      </w:r>
+      <w:r>
+        <w:rPr>
+          <w:b w:val="0"/>
+          <w:i w:val="0"/>
+        </w:rPr>
+        <w:t xml:space="preserve"> application shows what we spend, by project, usage account and model.</w:t>
+      </w:r>
+    </w:p>
+    <w:tbl>
+      <w:tblPr>
+        <w:tblStyle w:val="TableGrid"/>
+        <w:tblW w:type="auto" w:w="0"/>
+        <w:jc w:val="center"/>
+        <w:tblLook w:firstColumn="1" w:firstRow="1" w:lastColumn="0" w:lastRow="0" w:noHBand="0" w:noVBand="1" w:val="04A0"/>
+      </w:tblPr>
+      <w:tblGrid>
+        <w:gridCol w:w="3249"/>
+        <w:gridCol w:w="3249"/>
+        <w:gridCol w:w="3249"/>
+      </w:tblGrid>
+      <w:tr>
+        <w:tc>
+          <w:tcPr>
+            <w:tcW w:type="dxa" w:w="2438"/>
+            <w:shd w:val="clear" w:color="auto" w:fill="00205B"/>
+          </w:tcPr>
+          <w:p>
+            <w:r/>
+            <w:r>
+              <w:rPr>
+                <w:b/>
+                <w:i w:val="0"/>
+                <w:color w:val="FFFFFF"/>
+                <w:sz w:val="20"/>
+              </w:rPr>
+              <w:t>Where in Resource Management</w:t>
+            </w:r>
+          </w:p>
+        </w:tc>
+        <w:tc>
+          <w:tcPr>
+            <w:tcW w:type="dxa" w:w="3402"/>
+            <w:shd w:val="clear" w:color="auto" w:fill="00205B"/>
+          </w:tcPr>
+          <w:p>
+            <w:r/>
+            <w:r>
+              <w:rPr>
+                <w:b/>
+                <w:i w:val="0"/>
+                <w:color w:val="FFFFFF"/>
+                <w:sz w:val="20"/>
+              </w:rPr>
+              <w:t>What it shows</w:t>
+            </w:r>
+          </w:p>
+        </w:tc>
+        <w:tc>
+          <w:tcPr>
+            <w:tcW w:type="dxa" w:w="3515"/>
+            <w:shd w:val="clear" w:color="auto" w:fill="00205B"/>
+          </w:tcPr>
+          <w:p>
+            <w:r/>
+            <w:r>
+              <w:rPr>
+                <w:b/>
+                <w:i w:val="0"/>
+                <w:color w:val="FFFFFF"/>
+                <w:sz w:val="20"/>
+              </w:rPr>
+              <w:t>How to use it</w:t>
+            </w:r>
+          </w:p>
+        </w:tc>
+      </w:tr>
+      <w:tr>
+        <w:tc>
+          <w:tcPr>
+            <w:tcW w:type="dxa" w:w="2438"/>
+          </w:tcPr>
+          <w:p>
+            <w:r/>
+            <w:r>
+              <w:rPr>
+                <w:b w:val="0"/>
+                <w:i w:val="0"/>
+                <w:sz w:val="20"/>
+              </w:rPr>
+              <w:t>AIP usage &amp; limits › View usage</w:t>
+            </w:r>
+          </w:p>
+        </w:tc>
+        <w:tc>
+          <w:tcPr>
+            <w:tcW w:type="dxa" w:w="3402"/>
+          </w:tcPr>
+          <w:p>
+            <w:r/>
+            <w:r>
+              <w:rPr>
+                <w:b w:val="0"/>
+                <w:i w:val="0"/>
+                <w:sz w:val="20"/>
+              </w:rPr>
+              <w:t>Tokens and requests per minute for each Gemini model, by project, for up to two weeks; dashed lines show when rate limits were hit</w:t>
+            </w:r>
+          </w:p>
+        </w:tc>
+        <w:tc>
+          <w:tcPr>
+            <w:tcW w:type="dxa" w:w="3515"/>
+          </w:tcPr>
+          <w:p>
+            <w:r/>
+            <w:r>
+              <w:rPr>
+                <w:b w:val="0"/>
+                <w:i w:val="0"/>
+                <w:sz w:val="20"/>
+              </w:rPr>
+              <w:t>Filter by model, project and time range; open your project to see usage per resource. It shows volume, not cost</w:t>
+            </w:r>
+          </w:p>
+        </w:tc>
+      </w:tr>
+      <w:tr>
+        <w:tc>
+          <w:tcPr>
+            <w:tcW w:type="dxa" w:w="2438"/>
+            <w:shd w:val="clear" w:color="auto" w:fill="EEF1F7"/>
+          </w:tcPr>
+          <w:p>
+            <w:r/>
+            <w:r>
+              <w:rPr>
+                <w:b w:val="0"/>
+                <w:i w:val="0"/>
+                <w:sz w:val="20"/>
+              </w:rPr>
+              <w:t>Analysis</w:t>
+            </w:r>
+          </w:p>
+        </w:tc>
+        <w:tc>
+          <w:tcPr>
+            <w:tcW w:type="dxa" w:w="3402"/>
+            <w:shd w:val="clear" w:color="auto" w:fill="EEF1F7"/>
+          </w:tcPr>
+          <w:p>
+            <w:r/>
+            <w:r>
+              <w:rPr>
+                <w:b w:val="0"/>
+                <w:i w:val="0"/>
+                <w:sz w:val="20"/>
+              </w:rPr>
+              <w:t>The cost view: daily LLM cost, split by model</w:t>
+            </w:r>
+          </w:p>
+        </w:tc>
+        <w:tc>
+          <w:tcPr>
+            <w:tcW w:type="dxa" w:w="3515"/>
+            <w:shd w:val="clear" w:color="auto" w:fill="EEF1F7"/>
+          </w:tcPr>
+          <w:p>
+            <w:r/>
+            <w:r>
+              <w:rPr>
+                <w:b w:val="0"/>
+                <w:i w:val="0"/>
+                <w:sz w:val="20"/>
+              </w:rPr>
+              <w:t>Filter by source: All LLMs; group by source; narrow it to your project or usage account</w:t>
+            </w:r>
+          </w:p>
+        </w:tc>
+      </w:tr>
+      <w:tr>
+        <w:tc>
+          <w:tcPr>
+            <w:tcW w:type="dxa" w:w="2438"/>
+          </w:tcPr>
+          <w:p>
+            <w:r/>
+            <w:r>
+              <w:rPr>
+                <w:b w:val="0"/>
+                <w:i w:val="0"/>
+                <w:sz w:val="20"/>
+              </w:rPr>
+              <w:t>Budgets (admins)</w:t>
+            </w:r>
+          </w:p>
+        </w:tc>
+        <w:tc>
+          <w:tcPr>
+            <w:tcW w:type="dxa" w:w="3402"/>
+          </w:tcPr>
+          <w:p>
+            <w:r/>
+            <w:r>
+              <w:rPr>
+                <w:b w:val="0"/>
+                <w:i w:val="0"/>
+                <w:sz w:val="20"/>
+              </w:rPr>
+              <w:t>Spend against a monthly, quarterly or yearly budget, with notification thresholds</w:t>
+            </w:r>
+          </w:p>
+        </w:tc>
+        <w:tc>
+          <w:tcPr>
+            <w:tcW w:type="dxa" w:w="3515"/>
+          </w:tcPr>
+          <w:p>
+            <w:r/>
+            <w:r>
+              <w:rPr>
+                <w:b w:val="0"/>
+                <w:i w:val="0"/>
+                <w:sz w:val="20"/>
+              </w:rPr>
+              <w:t>Set by an enrollment or Resource Management administrator, on all usage or one usage account, with the people to notify</w:t>
+            </w:r>
+          </w:p>
+        </w:tc>
+      </w:tr>
+    </w:tbl>
+    <w:p>
+      <w:pPr>
+        <w:spacing w:after="40"/>
+      </w:pPr>
+    </w:p>
+    <w:p>
+      <w:pPr>
+        <w:pStyle w:val="Heading2"/>
+      </w:pPr>
+      <w:r>
+        <w:t>Check your own usage (weekly)</w:t>
+      </w:r>
+    </w:p>
+    <w:p>
+      <w:pPr>
+        <w:pStyle w:val="ListNumber"/>
+        <w:spacing w:after="60"/>
+      </w:pPr>
+      <w:r>
+        <w:rPr>
+          <w:b w:val="0"/>
+          <w:i w:val="0"/>
+        </w:rPr>
+        <w:t xml:space="preserve">Open </w:t>
+      </w:r>
+      <w:r>
+        <w:rPr>
+          <w:b/>
+          <w:i w:val="0"/>
+        </w:rPr>
+        <w:t>Resource Management</w:t>
+      </w:r>
+      <w:r>
+        <w:rPr>
+          <w:b w:val="0"/>
+          <w:i w:val="0"/>
+        </w:rPr>
+        <w:t xml:space="preserve"> › </w:t>
+      </w:r>
+      <w:r>
+        <w:rPr>
+          <w:b/>
+          <w:i w:val="0"/>
+        </w:rPr>
+        <w:t>AIP usage &amp; limits</w:t>
+      </w:r>
+      <w:r>
+        <w:rPr>
+          <w:b w:val="0"/>
+          <w:i w:val="0"/>
+        </w:rPr>
+        <w:t xml:space="preserve"> › </w:t>
+      </w:r>
+      <w:r>
+        <w:rPr>
+          <w:b/>
+          <w:i w:val="0"/>
+        </w:rPr>
+        <w:t>View usage</w:t>
+      </w:r>
+      <w:r>
+        <w:rPr>
+          <w:b w:val="0"/>
+          <w:i w:val="0"/>
+        </w:rPr>
+        <w:t xml:space="preserve"> and filter to your project. Look for spikes.</w:t>
+      </w:r>
+    </w:p>
+    <w:p>
+      <w:pPr>
+        <w:pStyle w:val="ListNumber"/>
+        <w:spacing w:after="60"/>
+      </w:pPr>
+      <w:r>
+        <w:rPr>
+          <w:b w:val="0"/>
+          <w:i w:val="0"/>
+        </w:rPr>
+        <w:t xml:space="preserve">Open </w:t>
+      </w:r>
+      <w:r>
+        <w:rPr>
+          <w:b/>
+          <w:i w:val="0"/>
+        </w:rPr>
+        <w:t>Analysis</w:t>
+      </w:r>
+      <w:r>
+        <w:rPr>
+          <w:b w:val="0"/>
+          <w:i w:val="0"/>
+        </w:rPr>
+        <w:t xml:space="preserve">, set </w:t>
+      </w:r>
+      <w:r>
+        <w:rPr>
+          <w:b/>
+          <w:i w:val="0"/>
+        </w:rPr>
+        <w:t>Filter by source</w:t>
+      </w:r>
+      <w:r>
+        <w:rPr>
+          <w:b w:val="0"/>
+          <w:i w:val="0"/>
+        </w:rPr>
+        <w:t xml:space="preserve"> to </w:t>
+      </w:r>
+      <w:r>
+        <w:rPr>
+          <w:b/>
+          <w:i w:val="0"/>
+        </w:rPr>
+        <w:t>All LLMs</w:t>
+      </w:r>
+      <w:r>
+        <w:rPr>
+          <w:b w:val="0"/>
+          <w:i w:val="0"/>
+        </w:rPr>
+        <w:t xml:space="preserve"> and </w:t>
+      </w:r>
+      <w:r>
+        <w:rPr>
+          <w:b/>
+          <w:i w:val="0"/>
+        </w:rPr>
+        <w:t>Group by source</w:t>
+      </w:r>
+      <w:r>
+        <w:rPr>
+          <w:b w:val="0"/>
+          <w:i w:val="0"/>
+        </w:rPr>
+        <w:t>, and check the cost trend for your project.</w:t>
+      </w:r>
+    </w:p>
+    <w:p>
+      <w:pPr>
+        <w:pStyle w:val="ListNumber"/>
+        <w:spacing w:after="60"/>
+      </w:pPr>
+      <w:r>
+        <w:rPr>
+          <w:b w:val="0"/>
+          <w:i w:val="0"/>
+        </w:rPr>
+        <w:t>Found a spike? Use the per-message token counts in the AI FDE chat outline to find the session that caused it, and fix the habit (section 5).</w:t>
+      </w:r>
+    </w:p>
+    <w:tbl>
+      <w:tblPr>
+        <w:tblW w:type="auto" w:w="0"/>
+        <w:tblLook w:firstColumn="1" w:firstRow="1" w:lastColumn="0" w:lastRow="0" w:noHBand="0" w:noVBand="1" w:val="04A0"/>
+      </w:tblPr>
+      <w:tblGrid>
+        <w:gridCol w:w="9746"/>
+      </w:tblGrid>
+      <w:tr>
+        <w:tc>
+          <w:tcPr>
+            <w:tcW w:type="dxa" w:w="9746"/>
+            <w:shd w:val="clear" w:color="auto" w:fill="C8326C"/>
+          </w:tcPr>
+          <w:p>
+            <w:r/>
+            <w:r>
+              <w:rPr>
+                <w:b/>
+                <w:i w:val="0"/>
+                <w:color w:val="FFFFFF"/>
+                <w:sz w:val="21"/>
+              </w:rPr>
+              <w:t xml:space="preserve">Over the threshold  </w:t>
+            </w:r>
+            <w:r>
+              <w:rPr>
+                <w:b w:val="0"/>
+                <w:i w:val="0"/>
+                <w:color w:val="FFFFFF"/>
+                <w:sz w:val="21"/>
+              </w:rPr>
+              <w:t>If AI FDE cost goes beyond the agreed threshold, the solution architect is notified, along with the individuals behind the usage. The solution architect reviews with them what drove the cost and agrees the fix.</w:t>
+            </w:r>
+          </w:p>
+        </w:tc>
+      </w:tr>
+    </w:tbl>
+    <w:p>
+      <w:pPr>
+        <w:spacing w:after="40"/>
+      </w:pPr>
+    </w:p>
+    <w:p>
+      <w:pPr>
+        <w:spacing w:after="120"/>
+      </w:pPr>
+      <w:r>
+        <w:rPr>
+          <w:b w:val="0"/>
+          <w:i/>
+          <w:color w:val="4A5568"/>
+          <w:sz w:val="18"/>
+        </w:rPr>
+        <w:t>Notes: budget notifications are sent after a threshold is crossed and can arrive late (in rare cases up to about a day), so don't wait for them: check your usage yourself. Budgets need a usage-based contract; available pages can differ between enrollments.</w:t>
+      </w:r>
+    </w:p>
+    <w:p>
+      <w:pPr>
+        <w:pStyle w:val="Heading1"/>
+      </w:pPr>
+      <w:r>
+        <w:t>8. Team practices</w:t>
       </w:r>
     </w:p>
     <w:p>
@@ -3287,7 +3750,7 @@
         <w:pStyle w:val="Heading1"/>
       </w:pPr>
       <w:r>
-        <w:t>8. Checklist</w:t>
+        <w:t>9. Checklist</w:t>
       </w:r>
     </w:p>
     <w:tbl>
@@ -3614,6 +4077,43 @@
           </w:p>
         </w:tc>
       </w:tr>
+      <w:tr>
+        <w:tc>
+          <w:tcPr>
+            <w:tcW w:type="dxa" w:w="3118"/>
+            <w:shd w:val="clear" w:color="auto" w:fill="EEF1F7"/>
+          </w:tcPr>
+          <w:p>
+            <w:r/>
+          </w:p>
+        </w:tc>
+        <w:tc>
+          <w:tcPr>
+            <w:tcW w:type="dxa" w:w="3118"/>
+            <w:shd w:val="clear" w:color="auto" w:fill="EEF1F7"/>
+          </w:tcPr>
+          <w:p>
+            <w:r/>
+          </w:p>
+        </w:tc>
+        <w:tc>
+          <w:tcPr>
+            <w:tcW w:type="dxa" w:w="3118"/>
+            <w:shd w:val="clear" w:color="auto" w:fill="EEF1F7"/>
+          </w:tcPr>
+          <w:p>
+            <w:r/>
+            <w:r>
+              <w:rPr>
+                <w:b w:val="0"/>
+                <w:i w:val="0"/>
+                <w:sz w:val="20"/>
+              </w:rPr>
+              <w:t>☐ Check cost in Resource Management</w:t>
+            </w:r>
+          </w:p>
+        </w:tc>
+      </w:tr>
     </w:tbl>
     <w:p>
       <w:pPr>
@@ -3883,6 +4383,76 @@
                 <w:sz w:val="20"/>
               </w:rPr>
               <w:t>Reusable instructions that can be loaded into a session (e.g. via a pre-fill link)</w:t>
+            </w:r>
+          </w:p>
+        </w:tc>
+      </w:tr>
+      <w:tr>
+        <w:tc>
+          <w:tcPr>
+            <w:tcW w:type="dxa" w:w="2551"/>
+          </w:tcPr>
+          <w:p>
+            <w:r/>
+            <w:r>
+              <w:rPr>
+                <w:b w:val="0"/>
+                <w:i w:val="0"/>
+                <w:sz w:val="20"/>
+              </w:rPr>
+              <w:t>Resource Management</w:t>
+            </w:r>
+          </w:p>
+        </w:tc>
+        <w:tc>
+          <w:tcPr>
+            <w:tcW w:type="dxa" w:w="6803"/>
+          </w:tcPr>
+          <w:p>
+            <w:r/>
+            <w:r>
+              <w:rPr>
+                <w:b w:val="0"/>
+                <w:i w:val="0"/>
+                <w:sz w:val="20"/>
+              </w:rPr>
+              <w:t>The platform app for usage, cost and budgets (AIP usage &amp; limits, Analysis, Budgets)</w:t>
+            </w:r>
+          </w:p>
+        </w:tc>
+      </w:tr>
+      <w:tr>
+        <w:tc>
+          <w:tcPr>
+            <w:tcW w:type="dxa" w:w="2551"/>
+            <w:shd w:val="clear" w:color="auto" w:fill="EEF1F7"/>
+          </w:tcPr>
+          <w:p>
+            <w:r/>
+            <w:r>
+              <w:rPr>
+                <w:b w:val="0"/>
+                <w:i w:val="0"/>
+                <w:sz w:val="20"/>
+              </w:rPr>
+              <w:t>Budget threshold</w:t>
+            </w:r>
+          </w:p>
+        </w:tc>
+        <w:tc>
+          <w:tcPr>
+            <w:tcW w:type="dxa" w:w="6803"/>
+            <w:shd w:val="clear" w:color="auto" w:fill="EEF1F7"/>
+          </w:tcPr>
+          <w:p>
+            <w:r/>
+            <w:r>
+              <w:rPr>
+                <w:b w:val="0"/>
+                <w:i w:val="0"/>
+                <w:sz w:val="20"/>
+              </w:rPr>
+              <w:t>A % of the budget that triggers a notification; over ours, the solution architect is notified</w:t>
             </w:r>
           </w:p>
         </w:tc>

</xml_diff>